<commit_message>
docs(kvkk): sunucu ülkesi Londra/BK + veri sorumlusu kimliği (madde 92 ✅)
FAZ 0 — KVKK paketine kesinleşen iki bilgi (PO teyitli 2026-08-26):
- Sunucu ülkesi: Londra / Birleşik Krallık (AWS eu-west-2). Eski
  "İrlanda" beyanı hatalıydı (eu-west-2=Londra/BK, eu-west-1=İrlanda).
  BK = AB üyesi DEĞİL -> yurt dışı aktarım değerlendirmesini etkiler.
- Veri sorumlusu/işletmeci kimliği dolduruldu (gerçek kişi; şirketleşince
  şirket bilgileriyle güncellenecek). Adres/KEP/VERBİS + destek@ e-postası
  kalan PO alanları olarak korundu.

Değişen: 01/02/03/07/08 yasal metinler + 00-AVUKAT (çelişki ÇÖZÜLDÜ,
hukukçu sorusuna BK-not) + README + envanter raporu ⚠️ GÜNCELLEME notu
(📸 dondurulmuş, silinmedi) + 00-KARAR-TAKIP madde 92 ✅. Word yeniden
üretildi (emoji temiz, Türkçe, İçindekiler/tablo/sayfa-no). Hukuki
metnin İÇERİĞİ değişmedi — yalnız placeholder + ülke.

Co-Authored-By: Claude Opus 4.8 (1M context) <noreply@anthropic.com>
</commit_message>
<xml_diff>
--- a/docs/kararlar/konu/kvkk-metinleri/KVKK-BELGE-PAKETI-2026-08-25.docx
+++ b/docs/kararlar/konu/kvkk-metinleri/KVKK-BELGE-PAKETI-2026-08-25.docx
@@ -527,16 +527,25 @@
         <w:t>Barındırma:</w:t>
       </w:r>
       <w:r>
-        <w:t xml:space="preserve"> bulut veritabanı (</w:t>
+        <w:t xml:space="preserve"> bulut veritabanı — </w:t>
       </w:r>
       <w:r>
         <w:rPr>
           <w:b/>
         </w:rPr>
-        <w:t>yurt dışı</w:t>
-      </w:r>
-      <w:r>
-        <w:t>) + uygulama sunucusu.</w:t>
+        <w:t>Londra / Birleşik Krallık</w:t>
+      </w:r>
+      <w:r>
+        <w:t xml:space="preserve"> (AWS Europe (London), bölge kodu </w:t>
+      </w:r>
+      <w:r>
+        <w:rPr>
+          <w:rFonts w:ascii="Consolas" w:hAnsi="Consolas"/>
+        </w:rPr>
+        <w:t>eu-west-2</w:t>
+      </w:r>
+      <w:r>
+        <w:t>; PO teyitli 2026-08-26) + uygulama sunucusu (Dokploy — ülke ayrıca teyit edilecek).</w:t>
       </w:r>
     </w:p>
     <w:p>
@@ -567,7 +576,7 @@
         <w:pStyle w:val="Heading3"/>
       </w:pPr>
       <w:r>
-        <w:t>[KRİTİK] SUNUCU ÜLKESİ ÇELİŞKİSİ (öncelikli — yasal metinde ülke beyanı kritik)</w:t>
+        <w:t>EVET SUNUCU ÜLKESİ — ÇÖZÜLDÜ (2026-08-26, PO teyitli)</w:t>
       </w:r>
     </w:p>
     <w:p>
@@ -575,166 +584,171 @@
         <w:pStyle w:val="ListBullet"/>
       </w:pPr>
       <w:r>
-        <w:t xml:space="preserve">Proje belgeleri veritabanı bölgesini </w:t>
-      </w:r>
-      <w:r>
         <w:rPr>
           <w:b/>
         </w:rPr>
+        <w:t>Veritabanı sunucusu Londra / Birleşik Krallık'tadır</w:t>
+      </w:r>
+      <w:r>
+        <w:t xml:space="preserve"> (AWS Europe (London), bölge kodu </w:t>
+      </w:r>
+      <w:r>
+        <w:rPr>
+          <w:rFonts w:ascii="Consolas" w:hAnsi="Consolas"/>
+        </w:rPr>
+        <w:t>eu-west-2</w:t>
+      </w:r>
+      <w:r>
+        <w:t>). PO bulut sağlayıcı konsolundan teyit etti (2026-08-26).</w:t>
+      </w:r>
+    </w:p>
+    <w:p>
+      <w:pPr>
+        <w:pStyle w:val="ListBullet"/>
+      </w:pPr>
+      <w:r>
+        <w:t xml:space="preserve">UYARI: </w:t>
+      </w:r>
+      <w:r>
+        <w:rPr>
+          <w:b/>
+        </w:rPr>
+        <w:t>GÜNCELLEME (2026-08-26):</w:t>
+      </w:r>
+      <w:r>
+        <w:t xml:space="preserve"> eski belgelerdeki </w:t>
+      </w:r>
+      <w:r>
+        <w:rPr>
+          <w:b/>
+        </w:rPr>
         <w:t>"eu-west-2 / İrlanda"</w:t>
       </w:r>
       <w:r>
-        <w:t xml:space="preserve"> yazıyor. </w:t>
+        <w:t xml:space="preserve"> beyanı </w:t>
       </w:r>
       <w:r>
         <w:rPr>
           <w:b/>
         </w:rPr>
-        <w:t>Bu içsel olarak ÇELİŞKİLİDİR:</w:t>
+        <w:t>HATALIYDI</w:t>
+      </w:r>
+      <w:r>
+        <w:t xml:space="preserve"> — </w:t>
+      </w:r>
+      <w:r>
+        <w:rPr>
+          <w:rFonts w:ascii="Consolas" w:hAnsi="Consolas"/>
+        </w:rPr>
+        <w:t>eu-west-2</w:t>
+      </w:r>
+      <w:r>
+        <w:t xml:space="preserve"> = Londra (BK), İrlanda ise </w:t>
+      </w:r>
+      <w:r>
+        <w:rPr>
+          <w:rFonts w:ascii="Consolas" w:hAnsi="Consolas"/>
+        </w:rPr>
+        <w:t>eu-west-1</w:t>
+      </w:r>
+      <w:r>
+        <w:t>. Doğru bölge Londra/BK olarak kesinleşti; yasal metinlere bu işlendi.</w:t>
+      </w:r>
+    </w:p>
+    <w:p>
+      <w:pPr>
+        <w:pStyle w:val="ListBullet"/>
+      </w:pPr>
+      <w:r>
+        <w:rPr>
+          <w:b/>
+        </w:rPr>
+        <w:t>UYARI: Hukukçu için kritik:</w:t>
       </w:r>
       <w:r>
         <w:t xml:space="preserve"> </w:t>
       </w:r>
       <w:r>
         <w:rPr>
-          <w:rFonts w:ascii="Consolas" w:hAnsi="Consolas"/>
-        </w:rPr>
-        <w:t>eu-west-2</w:t>
-      </w:r>
-      <w:r>
-        <w:t xml:space="preserve"> bölge kodu </w:t>
-      </w:r>
-      <w:r>
-        <w:rPr>
           <w:b/>
         </w:rPr>
-        <w:t>Londra (Birleşik Krallık)</w:t>
-      </w:r>
-      <w:r>
-        <w:t xml:space="preserve">'a, İrlanda ise </w:t>
-      </w:r>
+        <w:t>Birleşik Krallık AB ÜYESİ DEĞİLDİR</w:t>
+      </w:r>
+      <w:r>
+        <w:t xml:space="preserve"> -&gt; İrlanda'dan (AB) farklı olarak ayrı bir yeterlilik/yurt dışı aktarım değerlendirmesi gerekir (bkz. Bölüm 4, Soru 3). Uygulama sunucusu (Dokploy) konumu ayrıca teyit edilecek.</w:t>
+      </w:r>
+    </w:p>
+    <w:p>
+      <w:pPr>
+        <w:pStyle w:val="Heading2"/>
+      </w:pPr>
+      <w:r>
+        <w:t>4. * HUKUKÇUYA SORULAR (tüm [HUKUKÇU KARARI] işaretleri + 3 açık soru)</w:t>
+      </w:r>
+    </w:p>
+    <w:p>
       <w:r>
         <w:rPr>
           <w:b/>
         </w:rPr>
-        <w:t>eu-west-1</w:t>
-      </w:r>
-      <w:r>
-        <w:t>'e karşılık gelir. Bir arşiv notu "eu-west-1/Ireland" diyor.</w:t>
-      </w:r>
-    </w:p>
-    <w:p>
-      <w:pPr>
-        <w:pStyle w:val="ListBullet"/>
+        <w:t>Belgelere gömülü kararlar:</w:t>
+      </w:r>
+    </w:p>
+    <w:p>
+      <w:pPr>
+        <w:pStyle w:val="ListNumber"/>
       </w:pPr>
       <w:r>
         <w:rPr>
           <w:b/>
         </w:rPr>
-        <w:t>UK vs İrlanda ayrımı KVKK yurt dışı aktarımı için önemlidir</w:t>
-      </w:r>
-      <w:r>
-        <w:t xml:space="preserve"> (İrlanda = AB; UK = AB dışı, ayrı yeterlilik değerlendirmesi).</w:t>
-      </w:r>
-    </w:p>
-    <w:p>
-      <w:pPr>
-        <w:pStyle w:val="ListBullet"/>
+        <w:t>DISC/psikometrik profil KVKK Md.6 özel nitelikli veri mi?</w:t>
+      </w:r>
+      <w:r>
+        <w:t xml:space="preserve"> (Sayılırsa: ayrı açık rıza + ek güvenlik tedbiri + aktarım kısıtı.) — *Belge 1, 2.*</w:t>
+      </w:r>
+    </w:p>
+    <w:p>
+      <w:pPr>
+        <w:pStyle w:val="ListNumber"/>
       </w:pPr>
       <w:r>
         <w:rPr>
           <w:b/>
         </w:rPr>
-        <w:t>-&gt; Yasal metinlerde ülke adı YAZILMADI</w:t>
-      </w:r>
-      <w:r>
-        <w:t>, `</w:t>
-      </w:r>
-      <w:r>
-        <w:rPr>
-          <w:i/>
-          <w:highlight w:val="lightGray"/>
-        </w:rPr>
-        <w:t>[PO DOLDURACAK: sağlayıcı panelinden teyitli sunucu ülkesi]</w:t>
-      </w:r>
-      <w:r>
-        <w:t xml:space="preserve">` bırakıldı. </w:t>
-      </w:r>
+        <w:t>VERBİS kaydı gerekli mi?</w:t>
+      </w:r>
+      <w:r>
+        <w:t xml:space="preserve"> İşletmeci gerçek kişi, çalışan yok, bilanço yok. — *Belge 1.*</w:t>
+      </w:r>
+    </w:p>
+    <w:p>
+      <w:pPr>
+        <w:pStyle w:val="ListNumber"/>
+      </w:pPr>
       <w:r>
         <w:rPr>
           <w:b/>
         </w:rPr>
-        <w:t>PO, bulut sağlayıcı konsolundan gerçek bölgeyi teyit etmeli.</w:t>
-      </w:r>
-      <w:r>
-        <w:t xml:space="preserve"> Uygulama sunucusu (Dokploy) konumu da kodda yok — teyit edilmeli.</w:t>
-      </w:r>
-    </w:p>
-    <w:p>
-      <w:pPr>
-        <w:pStyle w:val="Heading2"/>
-      </w:pPr>
-      <w:r>
-        <w:t>4. * HUKUKÇUYA SORULAR (tüm [HUKUKÇU KARARI] işaretleri + 3 açık soru)</w:t>
-      </w:r>
-    </w:p>
-    <w:p>
+        <w:t>Yurt dışı aktarım (Md.9, 2024):</w:t>
+      </w:r>
+      <w:r>
+        <w:t xml:space="preserve"> sistematik aktarım için açık rıza yeterli mi, standart sözleşme + Kurul bildirimi mi? Ve </w:t>
+      </w:r>
       <w:r>
         <w:rPr>
           <w:b/>
         </w:rPr>
-        <w:t>Belgelere gömülü kararlar:</w:t>
-      </w:r>
-    </w:p>
-    <w:p>
-      <w:pPr>
-        <w:pStyle w:val="ListNumber"/>
-      </w:pPr>
+        <w:t>SS-3 açık sorusu:</w:t>
+      </w:r>
+      <w:r>
+        <w:t xml:space="preserve"> Kurul'un "Veri İşleyenden Veri İşleyene" standart sözleşmesini bulut/e-posta sağlayıcısı imzalamazsa, mevcut GDPR DPA'sı bir mekanizmaya karşılık gelir mi; gelmezse kalan risk? — *Belge 2, 8.* </w:t>
+      </w:r>
       <w:r>
         <w:rPr>
           <w:b/>
         </w:rPr>
-        <w:t>DISC/psikometrik profil KVKK Md.6 özel nitelikli veri mi?</w:t>
-      </w:r>
-      <w:r>
-        <w:t xml:space="preserve"> (Sayılırsa: ayrı açık rıza + ek güvenlik tedbiri + aktarım kısıtı.) — *Belge 1, 2.*</w:t>
-      </w:r>
-    </w:p>
-    <w:p>
-      <w:pPr>
-        <w:pStyle w:val="ListNumber"/>
-      </w:pPr>
-      <w:r>
-        <w:rPr>
-          <w:b/>
-        </w:rPr>
-        <w:t>VERBİS kaydı gerekli mi?</w:t>
-      </w:r>
-      <w:r>
-        <w:t xml:space="preserve"> İşletmeci gerçek kişi, çalışan yok, bilanço yok. — *Belge 1.*</w:t>
-      </w:r>
-    </w:p>
-    <w:p>
-      <w:pPr>
-        <w:pStyle w:val="ListNumber"/>
-      </w:pPr>
-      <w:r>
-        <w:rPr>
-          <w:b/>
-        </w:rPr>
-        <w:t>Yurt dışı aktarım (Md.9, 2024):</w:t>
-      </w:r>
-      <w:r>
-        <w:t xml:space="preserve"> sistematik aktarım için açık rıza yeterli mi, standart sözleşme + Kurul bildirimi mi? Ve </w:t>
-      </w:r>
-      <w:r>
-        <w:rPr>
-          <w:b/>
-        </w:rPr>
-        <w:t>SS-3 açık sorusu:</w:t>
-      </w:r>
-      <w:r>
-        <w:t xml:space="preserve"> Kurul'un "Veri İşleyenden Veri İşleyene" standart sözleşmesini bulut/e-posta sağlayıcısı imzalamazsa, mevcut GDPR DPA'sı bir mekanizmaya karşılık gelir mi; gelmezse kalan risk? — *Belge 2, 8.*</w:t>
+        <w:t>UYARI: Not (2026-08-26, PO teyitli): sunucu Birleşik Krallık'tadır (AB üyesi DEĞİL) — değerlendirmeyi buna göre yapmanızı rica ederiz.</w:t>
       </w:r>
     </w:p>
     <w:p>
@@ -839,21 +853,191 @@
         <w:pStyle w:val="Heading2"/>
       </w:pPr>
       <w:r>
-        <w:t>5. [PO DOLDURACAK] alanları (tam liste)</w:t>
-      </w:r>
-    </w:p>
-    <w:p>
-      <w:r>
-        <w:t xml:space="preserve">Veri sorumlusu kimliği (ad/unvan) · adres · MERSİS/vergi no (varsa) · KEP adresi · </w:t>
+        <w:t>5. [PO DOLDURACAK] alanları (kalan)</w:t>
+      </w:r>
+    </w:p>
+    <w:p>
+      <w:pPr>
+        <w:ind w:left="288"/>
+      </w:pPr>
+      <w:r>
+        <w:rPr>
+          <w:i/>
+          <w:sz w:val="19"/>
+        </w:rPr>
+        <w:t xml:space="preserve">EVET </w:t>
       </w:r>
       <w:r>
         <w:rPr>
           <w:b/>
+          <w:i/>
+          <w:sz w:val="19"/>
+        </w:rPr>
+        <w:t>Kapandı (2026-08-26, PO teyitli):</w:t>
+      </w:r>
+      <w:r>
+        <w:rPr>
+          <w:i/>
+          <w:sz w:val="19"/>
+        </w:rPr>
+        <w:t xml:space="preserve"> veri sorumlusu </w:t>
+      </w:r>
+      <w:r>
+        <w:rPr>
+          <w:b/>
+          <w:i/>
+          <w:sz w:val="19"/>
+        </w:rPr>
+        <w:t>kimliği/adı</w:t>
+      </w:r>
+      <w:r>
+        <w:rPr>
+          <w:i/>
+          <w:sz w:val="19"/>
+        </w:rPr>
+        <w:t xml:space="preserve"> (gerçek kişi — bkz. aşağıdaki not) · </w:t>
+      </w:r>
+      <w:r>
+        <w:rPr>
+          <w:b/>
+          <w:i/>
+          <w:sz w:val="19"/>
+        </w:rPr>
+        <w:t>bulut sağlayıcı ülkesi</w:t>
+      </w:r>
+      <w:r>
+        <w:rPr>
+          <w:i/>
+          <w:sz w:val="19"/>
+        </w:rPr>
+        <w:t xml:space="preserve"> (Londra/BK).</w:t>
+      </w:r>
+    </w:p>
+    <w:p>
+      <w:pPr>
+        <w:ind w:left="288"/>
+      </w:pPr>
+      <w:r>
+        <w:rPr>
+          <w:b/>
+          <w:i/>
+          <w:sz w:val="19"/>
+        </w:rPr>
+        <w:t>Kalan:</w:t>
+      </w:r>
+      <w:r>
+        <w:rPr>
+          <w:i/>
+          <w:sz w:val="19"/>
+        </w:rPr>
+        <w:t xml:space="preserve"> veri sorumlusu </w:t>
+      </w:r>
+      <w:r>
+        <w:rPr>
+          <w:b/>
+          <w:i/>
+          <w:sz w:val="19"/>
+        </w:rPr>
+        <w:t>adresi · MERSİS/vergi no (varsa) · KEP adresi</w:t>
+      </w:r>
+      <w:r>
+        <w:rPr>
+          <w:i/>
+          <w:sz w:val="19"/>
+        </w:rPr>
+        <w:t xml:space="preserve"> · </w:t>
+      </w:r>
+      <w:r>
+        <w:rPr>
+          <w:b/>
+          <w:i/>
+          <w:sz w:val="19"/>
         </w:rPr>
         <w:t>başvuru `destek@` e-postası (kodda tanımsız — kurulacak)</w:t>
       </w:r>
       <w:r>
-        <w:t xml:space="preserve"> · bulut sağlayıcı teyitli ülke · uygulama sunucusu ülkesi · VERBİS kayıt durumu · önceki hukukçu geri bildiriminin kapsamı · yürürlük tarihi.</w:t>
+        <w:rPr>
+          <w:i/>
+          <w:sz w:val="19"/>
+        </w:rPr>
+        <w:t xml:space="preserve"> · uygulama sunucusu (Dokploy) ülkesi · VERBİS kayıt durumu · önceki hukukçu geri bildiriminin kapsamı · yürürlük tarihi.</w:t>
+      </w:r>
+    </w:p>
+    <w:p>
+      <w:pPr>
+        <w:ind w:left="288"/>
+      </w:pPr>
+    </w:p>
+    <w:p>
+      <w:pPr>
+        <w:ind w:left="288"/>
+      </w:pPr>
+      <w:r>
+        <w:rPr>
+          <w:i/>
+          <w:sz w:val="19"/>
+        </w:rPr>
+        <w:t xml:space="preserve">ℹ </w:t>
+      </w:r>
+      <w:r>
+        <w:rPr>
+          <w:b/>
+          <w:i/>
+          <w:sz w:val="19"/>
+        </w:rPr>
+        <w:t>Veri sorumlusu kimliği:</w:t>
+      </w:r>
+      <w:r>
+        <w:rPr>
+          <w:i/>
+          <w:sz w:val="19"/>
+        </w:rPr>
+        <w:t xml:space="preserve"> şu an </w:t>
+      </w:r>
+      <w:r>
+        <w:rPr>
+          <w:b/>
+          <w:i/>
+          <w:sz w:val="19"/>
+        </w:rPr>
+        <w:t>gerçek kişi</w:t>
+      </w:r>
+      <w:r>
+        <w:rPr>
+          <w:i/>
+          <w:sz w:val="19"/>
+        </w:rPr>
+        <w:t xml:space="preserve"> (işletmeci, sosyal sorumluluk projesi — şirket değil). </w:t>
+      </w:r>
+      <w:r>
+        <w:rPr>
+          <w:b/>
+          <w:i/>
+          <w:sz w:val="19"/>
+        </w:rPr>
+        <w:t>Şirketleşene kadar</w:t>
+      </w:r>
+      <w:r>
+        <w:rPr>
+          <w:i/>
+          <w:sz w:val="19"/>
+        </w:rPr>
+        <w:t xml:space="preserve"> gerçek kişi kimliği geçerlidir; şirket kurulunca </w:t>
+      </w:r>
+      <w:r>
+        <w:rPr>
+          <w:b/>
+          <w:i/>
+          <w:sz w:val="19"/>
+        </w:rPr>
+        <w:t>şirket unvanı/bilgileriyle</w:t>
+      </w:r>
+      <w:r>
+        <w:rPr>
+          <w:i/>
+          <w:sz w:val="19"/>
+        </w:rPr>
+        <w:t xml:space="preserve"> güncellenecektir (PO kararı, 2026-08-26).</w:t>
       </w:r>
     </w:p>
     <w:p>
@@ -1318,10 +1502,42 @@
       </w:r>
       <w:r>
         <w:rPr>
+          <w:b/>
+        </w:rPr>
+        <w:t>Zahid Sami Ata</w:t>
+      </w:r>
+      <w:r>
+        <w:t xml:space="preserve"> (gerçek kişi/işletmeci — sosyal sorumluluk projesi) · adres: </w:t>
+      </w:r>
+      <w:r>
+        <w:rPr>
           <w:i/>
           <w:highlight w:val="lightGray"/>
         </w:rPr>
-        <w:t>[PO DOLDURACAK: veri sorumlusunun tam kimliği — gerçek kişi ad/soyad veya varsa unvan; adres; KEP/e-posta; VERBİS kayıt no varsa]</w:t>
+        <w:t>[PO DOLDURACAK]</w:t>
+      </w:r>
+      <w:r>
+        <w:t xml:space="preserve"> · KEP/e-posta: </w:t>
+      </w:r>
+      <w:r>
+        <w:rPr>
+          <w:i/>
+          <w:highlight w:val="lightGray"/>
+        </w:rPr>
+        <w:t>[PO DOLDURACAK]</w:t>
+      </w:r>
+      <w:r>
+        <w:t xml:space="preserve"> · VERBİS kayıt no: </w:t>
+      </w:r>
+      <w:r>
+        <w:rPr>
+          <w:i/>
+          <w:highlight w:val="lightGray"/>
+        </w:rPr>
+        <w:t>[PO DOLDURACAK, varsa]</w:t>
+      </w:r>
+      <w:r>
+        <w:t>.</w:t>
       </w:r>
     </w:p>
     <w:p>
@@ -1336,7 +1552,16 @@
         <w:t>[HUKUKÇU KARARI 2: VERBİS kaydı gerekli mi?]</w:t>
       </w:r>
       <w:r>
-        <w:t>)*</w:t>
+        <w:t xml:space="preserve">. </w:t>
+      </w:r>
+      <w:r>
+        <w:rPr>
+          <w:b/>
+        </w:rPr>
+        <w:t>Şirketleşene kadar</w:t>
+      </w:r>
+      <w:r>
+        <w:t xml:space="preserve"> gerçek kişi kimliği geçerlidir; şirket kurulunca şirket unvanı/bilgileriyle güncellenecektir — PO kararı 2026-08-26.)*</w:t>
       </w:r>
     </w:p>
     <w:p>
@@ -1567,107 +1792,115 @@
         <w:t>Barındırma (yurt dışı):</w:t>
       </w:r>
       <w:r>
-        <w:t xml:space="preserve"> Veritabanı bulut sağlayıcısında barındırılır — **</w:t>
+        <w:t xml:space="preserve"> Veritabanı bulut sağlayıcısında </w:t>
+      </w:r>
+      <w:r>
+        <w:rPr>
+          <w:b/>
+        </w:rPr>
+        <w:t>Londra / Birleşik Krallık</w:t>
+      </w:r>
+      <w:r>
+        <w:t xml:space="preserve">'ta barındırılır (AWS Europe (London), bölge kodu </w:t>
+      </w:r>
+      <w:r>
+        <w:rPr>
+          <w:rFonts w:ascii="Consolas" w:hAnsi="Consolas"/>
+        </w:rPr>
+        <w:t>eu-west-2</w:t>
+      </w:r>
+      <w:r>
+        <w:t>; PO teyitli 2026-08-26). *(UYARI: Birleşik Krallık AB üyesi değildir — yurt dışı aktarım değerlendirmesi buna göre yapılır; bkz. Açık Rıza Metni ve kapak dosyası.)*</w:t>
+      </w:r>
+    </w:p>
+    <w:p>
+      <w:pPr>
+        <w:pStyle w:val="ListBullet"/>
+      </w:pPr>
+      <w:r>
+        <w:rPr>
+          <w:b/>
+        </w:rPr>
+        <w:t>Kimlik doğrulama (isteğe bağlı):</w:t>
+      </w:r>
+      <w:r>
+        <w:t xml:space="preserve"> Google / LinkedIn ile giriş seçildiğinde bu sağlayıcılarla asgari kimlik verisi (e-posta, ad) alışverişi (yurt dışı).</w:t>
+      </w:r>
+    </w:p>
+    <w:p>
+      <w:pPr>
+        <w:pStyle w:val="ListBullet"/>
+      </w:pPr>
+      <w:r>
+        <w:rPr>
+          <w:b/>
+        </w:rPr>
+        <w:t>E-posta:</w:t>
+      </w:r>
+      <w:r>
+        <w:t xml:space="preserve"> bildirim/şifre-sıfırlama e-postaları için SMTP sağlayıcısı (alıcı e-posta + ad).</w:t>
+      </w:r>
+    </w:p>
+    <w:p>
+      <w:pPr>
+        <w:pStyle w:val="ListBullet"/>
+      </w:pPr>
+      <w:r>
+        <w:rPr>
+          <w:b/>
+        </w:rPr>
+        <w:t>Not:</w:t>
+      </w:r>
+      <w:r>
+        <w:t xml:space="preserve"> Reklam/analitik üçüncü taraflara aktarım </w:t>
+      </w:r>
+      <w:r>
+        <w:rPr>
+          <w:b/>
+        </w:rPr>
+        <w:t>YOKTUR</w:t>
+      </w:r>
+      <w:r>
+        <w:t xml:space="preserve"> (analitik altyapı şu an aktif değildir).</w:t>
+      </w:r>
+    </w:p>
+    <w:p>
+      <w:r>
+        <w:rPr>
+          <w:b/>
+        </w:rPr>
+        <w:t>Toplama yöntemi:</w:t>
+      </w:r>
+      <w:r>
+        <w:t xml:space="preserve"> kayıt formu, sosyal medya ile giriş (OAuth), kullanıcı tarafından doldurulan profil ve test/anket yanıtları (otomatik + kısmen otomatik yöntemler).</w:t>
+      </w:r>
+    </w:p>
+    <w:p>
+      <w:r>
+        <w:rPr>
+          <w:b/>
+        </w:rPr>
+        <w:t>İlgili kişi hakları (KVKK Md.11):</w:t>
+      </w:r>
+      <w:r>
+        <w:t xml:space="preserve"> kişisel verinizin işlenip işlenmediğini öğrenme, işlenmişse buna ilişkin bilgi talep etme, işlenme amacını öğrenme, aktarıldığı üçüncü kişileri bilme, eksik/yanlış işlenmişse düzeltilmesini, şartlar oluşmuşsa silinmesini/anonimleştirilmesini isteme, işlemenin münhasıran otomatik sistemlerle analiziyle aleyhinize bir sonuç çıkmasına itiraz, zarara uğramanız hâlinde giderim talep etme.</w:t>
+      </w:r>
+    </w:p>
+    <w:p>
+      <w:r>
+        <w:rPr>
+          <w:b/>
+        </w:rPr>
+        <w:t>Başvuru yolu:</w:t>
+      </w:r>
+      <w:r>
+        <w:t xml:space="preserve"> </w:t>
       </w:r>
       <w:r>
         <w:rPr>
           <w:i/>
           <w:highlight w:val="lightGray"/>
         </w:rPr>
-        <w:t>[PO DOLDURACAK: sağlayıcı panelinden teyitli sunucu ülkesi]</w:t>
-      </w:r>
-      <w:r>
-        <w:t>** *([KRİTİK] belgelerde çelişki var — kapak dosyasına bkz.; yanlış ülke beyanı yasal risk)*.</w:t>
-      </w:r>
-    </w:p>
-    <w:p>
-      <w:pPr>
-        <w:pStyle w:val="ListBullet"/>
-      </w:pPr>
-      <w:r>
-        <w:rPr>
-          <w:b/>
-        </w:rPr>
-        <w:t>Kimlik doğrulama (isteğe bağlı):</w:t>
-      </w:r>
-      <w:r>
-        <w:t xml:space="preserve"> Google / LinkedIn ile giriş seçildiğinde bu sağlayıcılarla asgari kimlik verisi (e-posta, ad) alışverişi (yurt dışı).</w:t>
-      </w:r>
-    </w:p>
-    <w:p>
-      <w:pPr>
-        <w:pStyle w:val="ListBullet"/>
-      </w:pPr>
-      <w:r>
-        <w:rPr>
-          <w:b/>
-        </w:rPr>
-        <w:t>E-posta:</w:t>
-      </w:r>
-      <w:r>
-        <w:t xml:space="preserve"> bildirim/şifre-sıfırlama e-postaları için SMTP sağlayıcısı (alıcı e-posta + ad).</w:t>
-      </w:r>
-    </w:p>
-    <w:p>
-      <w:pPr>
-        <w:pStyle w:val="ListBullet"/>
-      </w:pPr>
-      <w:r>
-        <w:rPr>
-          <w:b/>
-        </w:rPr>
-        <w:t>Not:</w:t>
-      </w:r>
-      <w:r>
-        <w:t xml:space="preserve"> Reklam/analitik üçüncü taraflara aktarım </w:t>
-      </w:r>
-      <w:r>
-        <w:rPr>
-          <w:b/>
-        </w:rPr>
-        <w:t>YOKTUR</w:t>
-      </w:r>
-      <w:r>
-        <w:t xml:space="preserve"> (analitik altyapı şu an aktif değildir).</w:t>
-      </w:r>
-    </w:p>
-    <w:p>
-      <w:r>
-        <w:rPr>
-          <w:b/>
-        </w:rPr>
-        <w:t>Toplama yöntemi:</w:t>
-      </w:r>
-      <w:r>
-        <w:t xml:space="preserve"> kayıt formu, sosyal medya ile giriş (OAuth), kullanıcı tarafından doldurulan profil ve test/anket yanıtları (otomatik + kısmen otomatik yöntemler).</w:t>
-      </w:r>
-    </w:p>
-    <w:p>
-      <w:r>
-        <w:rPr>
-          <w:b/>
-        </w:rPr>
-        <w:t>İlgili kişi hakları (KVKK Md.11):</w:t>
-      </w:r>
-      <w:r>
-        <w:t xml:space="preserve"> kişisel verinizin işlenip işlenmediğini öğrenme, işlenmişse buna ilişkin bilgi talep etme, işlenme amacını öğrenme, aktarıldığı üçüncü kişileri bilme, eksik/yanlış işlenmişse düzeltilmesini, şartlar oluşmuşsa silinmesini/anonimleştirilmesini isteme, işlemenin münhasıran otomatik sistemlerle analiziyle aleyhinize bir sonuç çıkmasına itiraz, zarara uğramanız hâlinde giderim talep etme.</w:t>
-      </w:r>
-    </w:p>
-    <w:p>
-      <w:r>
-        <w:rPr>
-          <w:b/>
-        </w:rPr>
-        <w:t>Başvuru yolu:</w:t>
-      </w:r>
-      <w:r>
-        <w:t xml:space="preserve"> </w:t>
-      </w:r>
-      <w:r>
-        <w:rPr>
-          <w:i/>
-          <w:highlight w:val="lightGray"/>
-        </w:rPr>
         <w:t>[PO DOLDURACAK: başvuru e-posta adresi — kodda `destek@` tanımsız, kurulacak]</w:t>
       </w:r>
       <w:r>
@@ -1716,22 +1949,22 @@
           <w:i/>
           <w:sz w:val="19"/>
         </w:rPr>
-        <w:t>Platform (`</w:t>
-      </w:r>
-      <w:r>
-        <w:rPr>
+        <w:t xml:space="preserve">Platform (işletmeci: </w:t>
+      </w:r>
+      <w:r>
+        <w:rPr>
+          <w:b/>
           <w:i/>
           <w:sz w:val="19"/>
-          <w:highlight w:val="lightGray"/>
-        </w:rPr>
-        <w:t>[PO DOLDURACAK: platform işletmecisi]</w:t>
+        </w:rPr>
+        <w:t>Zahid Sami Ata</w:t>
       </w:r>
       <w:r>
         <w:rPr>
           <w:i/>
           <w:sz w:val="19"/>
         </w:rPr>
-        <w:t xml:space="preserve">`) bu verileri </w:t>
+        <w:t xml:space="preserve"> — gerçek kişi/sosyal sorumluluk projesi) bu verileri </w:t>
       </w:r>
       <w:r>
         <w:rPr>
@@ -2271,252 +2504,22 @@
           <w:i/>
           <w:sz w:val="19"/>
         </w:rPr>
-        <w:t xml:space="preserve">gelmezse kalan risk nedir? **Sunucu ülkesi </w:t>
-      </w:r>
-      <w:r>
-        <w:rPr>
+        <w:t xml:space="preserve">gelmezse kalan risk nedir? </w:t>
+      </w:r>
+      <w:r>
+        <w:rPr>
+          <w:b/>
           <w:i/>
           <w:sz w:val="19"/>
-          <w:highlight w:val="lightGray"/>
-        </w:rPr>
-        <w:t>[PO DOLDURACAK]</w:t>
+        </w:rPr>
+        <w:t>Sunucu ülkesi: Londra / Birleşik Krallık</w:t>
       </w:r>
       <w:r>
         <w:rPr>
           <w:i/>
           <w:sz w:val="19"/>
         </w:rPr>
-        <w:t xml:space="preserve"> — belge çelişkisi var (kapak dosyası).**</w:t>
-      </w:r>
-    </w:p>
-    <w:p>
-      <w:pPr>
-        <w:pStyle w:val="Heading2"/>
-      </w:pPr>
-      <w:r>
-        <w:t>UYARI: MEVCUT DURUM BULGUSU (kod gerçeği — envanter C-6) — dürüst beyan</w:t>
-      </w:r>
-    </w:p>
-    <w:p>
-      <w:r>
-        <w:t xml:space="preserve">Aşağıdakiler </w:t>
-      </w:r>
-      <w:r>
-        <w:rPr>
-          <w:b/>
-        </w:rPr>
-        <w:t>şu anki kodda böyle</w:t>
-      </w:r>
-      <w:r>
-        <w:t>; hukukçu onayıyla düzeltilecek. Bu paket bunları gizlemez:</w:t>
-      </w:r>
-    </w:p>
-    <w:p>
-      <w:pPr>
-        <w:pStyle w:val="ListNumber"/>
-      </w:pPr>
-      <w:r>
-        <w:rPr>
-          <w:b/>
-        </w:rPr>
-        <w:t>KVKK onayı + 18+ beyanı TEK kutuda birleşik</w:t>
-      </w:r>
-      <w:r>
-        <w:t xml:space="preserve"> (</w:t>
-      </w:r>
-      <w:r>
-        <w:rPr>
-          <w:rFonts w:ascii="Consolas" w:hAnsi="Consolas"/>
-        </w:rPr>
-        <w:t>_RegisterContent.tsx:414</w:t>
-      </w:r>
-      <w:r>
-        <w:t>) — açık rıza "özgür/ayrık" ilkesiyle çelişebilir.</w:t>
-      </w:r>
-    </w:p>
-    <w:p>
-      <w:pPr>
-        <w:pStyle w:val="ListNumber"/>
-      </w:pPr>
-      <w:r>
-        <w:rPr>
-          <w:b/>
-        </w:rPr>
-        <w:t>OAuth (Google/LinkedIn) girişinde açık rıza kutusu UI'da GÖSTERİLMİYOR</w:t>
-      </w:r>
-      <w:r>
-        <w:t xml:space="preserve"> — kod "OAuth başlatmak = rıza" varsayıyor (</w:t>
-      </w:r>
-      <w:r>
-        <w:rPr>
-          <w:rFonts w:ascii="Consolas" w:hAnsi="Consolas"/>
-        </w:rPr>
-        <w:t>oauthService.ts:112</w:t>
-      </w:r>
-      <w:r>
-        <w:t xml:space="preserve"> implicit </w:t>
-      </w:r>
-      <w:r>
-        <w:rPr>
-          <w:rFonts w:ascii="Consolas" w:hAnsi="Consolas"/>
-        </w:rPr>
-        <w:t>kvkkConsentAt</w:t>
-      </w:r>
-      <w:r>
-        <w:t>).</w:t>
-      </w:r>
-    </w:p>
-    <w:p>
-      <w:pPr>
-        <w:pStyle w:val="ListNumber"/>
-      </w:pPr>
-      <w:r>
-        <w:rPr>
-          <w:b/>
-        </w:rPr>
-        <w:t>Self-serve kurum başvurusunda 18+ ibaresi bile yok.</w:t>
-      </w:r>
-    </w:p>
-    <w:p>
-      <w:pPr>
-        <w:pStyle w:val="ListNumber"/>
-      </w:pPr>
-      <w:r>
-        <w:rPr>
-          <w:b/>
-        </w:rPr>
-        <w:t>Rıza metninin SÜRÜMÜ tutulmuyor</w:t>
-      </w:r>
-      <w:r>
-        <w:t xml:space="preserve"> (yalnız zaman damgası) -&gt; hangi metne rıza verildiği ispatlanamıyor.</w:t>
-      </w:r>
-    </w:p>
-    <w:p>
-      <w:pPr>
-        <w:pStyle w:val="Heading3"/>
-      </w:pPr>
-      <w:r>
-        <w:t>Önerilen ayrık tasarım (yalnız TASLAK öneri — KOD BU TURDA YAZILMADI)</w:t>
-      </w:r>
-    </w:p>
-    <w:p>
-      <w:pPr>
-        <w:pStyle w:val="ListBullet"/>
-      </w:pPr>
-      <w:r>
-        <w:t xml:space="preserve">Kayıt/giriş ekranında </w:t>
-      </w:r>
-      <w:r>
-        <w:rPr>
-          <w:b/>
-        </w:rPr>
-        <w:t>ayrı kutular:</w:t>
-      </w:r>
-      <w:r>
-        <w:t xml:space="preserve"> (a) Aydınlatma metnini okudum · (b) 18 yaşımı doldurdum · (c) Genel açık rıza · (d) Psikometrik veri açık rızası · (e) Yurt dışı aktarım açık rızası. Her biri </w:t>
-      </w:r>
-      <w:r>
-        <w:rPr>
-          <w:b/>
-        </w:rPr>
-        <w:t>bağımsız</w:t>
-      </w:r>
-      <w:r>
-        <w:t>, hizmet için zorunlu olmayanlar işaretsiz bırakılabilir.</w:t>
-      </w:r>
-    </w:p>
-    <w:p>
-      <w:pPr>
-        <w:pStyle w:val="ListBullet"/>
-      </w:pPr>
-      <w:r>
-        <w:t>OAuth akışında da aynı kutular giriş ÖNCESİ gösterilir.</w:t>
-      </w:r>
-    </w:p>
-    <w:p>
-      <w:pPr>
-        <w:pStyle w:val="ListBullet"/>
-      </w:pPr>
-      <w:r>
-        <w:t xml:space="preserve">Her rıza için </w:t>
-      </w:r>
-      <w:r>
-        <w:rPr>
-          <w:b/>
-        </w:rPr>
-        <w:t>metin sürümü</w:t>
-      </w:r>
-      <w:r>
-        <w:t xml:space="preserve"> (ör. </w:t>
-      </w:r>
-      <w:r>
-        <w:rPr>
-          <w:rFonts w:ascii="Consolas" w:hAnsi="Consolas"/>
-        </w:rPr>
-        <w:t>v2026-09</w:t>
-      </w:r>
-      <w:r>
-        <w:t>) DB'ye kaydedilir -&gt; ispat.</w:t>
-      </w:r>
-    </w:p>
-    <w:p>
-      <w:pPr>
-        <w:pStyle w:val="ListBullet"/>
-      </w:pPr>
-      <w:r>
-        <w:t xml:space="preserve">Uygulama iş maddeleri: </w:t>
-      </w:r>
-      <w:r>
-        <w:rPr>
-          <w:rFonts w:ascii="Consolas" w:hAnsi="Consolas"/>
-        </w:rPr>
-        <w:t>00-KARAR-TAKIP</w:t>
-      </w:r>
-      <w:r>
-        <w:t xml:space="preserve"> madde 82 (sürümleme) + madde 83 (rıza kutusu ayrımı). </w:t>
-      </w:r>
-      <w:r>
-        <w:rPr>
-          <w:b/>
-        </w:rPr>
-        <w:t>Kod değişikliği hukukçu kararına bağlı.</w:t>
-      </w:r>
-    </w:p>
-    <w:p>
-      <w:r>
-        <w:br w:type="page"/>
-      </w:r>
-    </w:p>
-    <w:p>
-      <w:pPr>
-        <w:pStyle w:val="Heading1"/>
-      </w:pPr>
-      <w:r>
-        <w:t>3) Gizlilik Politikası</w:t>
-      </w:r>
-    </w:p>
-    <w:p>
-      <w:pPr>
-        <w:ind w:left="288"/>
-      </w:pPr>
-      <w:r>
-        <w:rPr>
-          <w:i/>
-          <w:sz w:val="19"/>
-        </w:rPr>
-        <w:t>UYARI: TASLAK (2026-08-25) — HUKUKÇU ONAYI OLMADAN YAYINLANMAZ.</w:t>
-      </w:r>
-    </w:p>
-    <w:p>
-      <w:pPr>
-        <w:ind w:left="288"/>
-      </w:pPr>
-      <w:r>
-        <w:rPr>
-          <w:i/>
-          <w:sz w:val="19"/>
-        </w:rPr>
-        <w:t xml:space="preserve">Kaynak: </w:t>
+        <w:t xml:space="preserve"> (AWS </w:t>
       </w:r>
       <w:r>
         <w:rPr>
@@ -2524,13 +2527,273 @@
           <w:i/>
           <w:sz w:val="19"/>
         </w:rPr>
-        <w:t>../../../raporlar/kod-denetimi/kvkk-veri-aktarim-envanteri-2026-08-25.md</w:t>
+        <w:t>eu-west-2</w:t>
       </w:r>
       <w:r>
         <w:rPr>
           <w:i/>
           <w:sz w:val="19"/>
         </w:rPr>
+        <w:t xml:space="preserve">; PO teyitli 2026-08-26). UYARI: </w:t>
+      </w:r>
+      <w:r>
+        <w:rPr>
+          <w:b/>
+          <w:i/>
+          <w:sz w:val="19"/>
+        </w:rPr>
+        <w:t>Birleşik Krallık AB üyesi DEĞİLDİR</w:t>
+      </w:r>
+      <w:r>
+        <w:rPr>
+          <w:i/>
+          <w:sz w:val="19"/>
+        </w:rPr>
+        <w:t xml:space="preserve"> — yurt dışı aktarım/yeterlilik değerlendirmesi buna göre yapılır.</w:t>
+      </w:r>
+    </w:p>
+    <w:p>
+      <w:pPr>
+        <w:pStyle w:val="Heading2"/>
+      </w:pPr>
+      <w:r>
+        <w:t>UYARI: MEVCUT DURUM BULGUSU (kod gerçeği — envanter C-6) — dürüst beyan</w:t>
+      </w:r>
+    </w:p>
+    <w:p>
+      <w:r>
+        <w:t xml:space="preserve">Aşağıdakiler </w:t>
+      </w:r>
+      <w:r>
+        <w:rPr>
+          <w:b/>
+        </w:rPr>
+        <w:t>şu anki kodda böyle</w:t>
+      </w:r>
+      <w:r>
+        <w:t>; hukukçu onayıyla düzeltilecek. Bu paket bunları gizlemez:</w:t>
+      </w:r>
+    </w:p>
+    <w:p>
+      <w:pPr>
+        <w:pStyle w:val="ListNumber"/>
+      </w:pPr>
+      <w:r>
+        <w:rPr>
+          <w:b/>
+        </w:rPr>
+        <w:t>KVKK onayı + 18+ beyanı TEK kutuda birleşik</w:t>
+      </w:r>
+      <w:r>
+        <w:t xml:space="preserve"> (</w:t>
+      </w:r>
+      <w:r>
+        <w:rPr>
+          <w:rFonts w:ascii="Consolas" w:hAnsi="Consolas"/>
+        </w:rPr>
+        <w:t>_RegisterContent.tsx:414</w:t>
+      </w:r>
+      <w:r>
+        <w:t>) — açık rıza "özgür/ayrık" ilkesiyle çelişebilir.</w:t>
+      </w:r>
+    </w:p>
+    <w:p>
+      <w:pPr>
+        <w:pStyle w:val="ListNumber"/>
+      </w:pPr>
+      <w:r>
+        <w:rPr>
+          <w:b/>
+        </w:rPr>
+        <w:t>OAuth (Google/LinkedIn) girişinde açık rıza kutusu UI'da GÖSTERİLMİYOR</w:t>
+      </w:r>
+      <w:r>
+        <w:t xml:space="preserve"> — kod "OAuth başlatmak = rıza" varsayıyor (</w:t>
+      </w:r>
+      <w:r>
+        <w:rPr>
+          <w:rFonts w:ascii="Consolas" w:hAnsi="Consolas"/>
+        </w:rPr>
+        <w:t>oauthService.ts:112</w:t>
+      </w:r>
+      <w:r>
+        <w:t xml:space="preserve"> implicit </w:t>
+      </w:r>
+      <w:r>
+        <w:rPr>
+          <w:rFonts w:ascii="Consolas" w:hAnsi="Consolas"/>
+        </w:rPr>
+        <w:t>kvkkConsentAt</w:t>
+      </w:r>
+      <w:r>
+        <w:t>).</w:t>
+      </w:r>
+    </w:p>
+    <w:p>
+      <w:pPr>
+        <w:pStyle w:val="ListNumber"/>
+      </w:pPr>
+      <w:r>
+        <w:rPr>
+          <w:b/>
+        </w:rPr>
+        <w:t>Self-serve kurum başvurusunda 18+ ibaresi bile yok.</w:t>
+      </w:r>
+    </w:p>
+    <w:p>
+      <w:pPr>
+        <w:pStyle w:val="ListNumber"/>
+      </w:pPr>
+      <w:r>
+        <w:rPr>
+          <w:b/>
+        </w:rPr>
+        <w:t>Rıza metninin SÜRÜMÜ tutulmuyor</w:t>
+      </w:r>
+      <w:r>
+        <w:t xml:space="preserve"> (yalnız zaman damgası) -&gt; hangi metne rıza verildiği ispatlanamıyor.</w:t>
+      </w:r>
+    </w:p>
+    <w:p>
+      <w:pPr>
+        <w:pStyle w:val="Heading3"/>
+      </w:pPr>
+      <w:r>
+        <w:t>Önerilen ayrık tasarım (yalnız TASLAK öneri — KOD BU TURDA YAZILMADI)</w:t>
+      </w:r>
+    </w:p>
+    <w:p>
+      <w:pPr>
+        <w:pStyle w:val="ListBullet"/>
+      </w:pPr>
+      <w:r>
+        <w:t xml:space="preserve">Kayıt/giriş ekranında </w:t>
+      </w:r>
+      <w:r>
+        <w:rPr>
+          <w:b/>
+        </w:rPr>
+        <w:t>ayrı kutular:</w:t>
+      </w:r>
+      <w:r>
+        <w:t xml:space="preserve"> (a) Aydınlatma metnini okudum · (b) 18 yaşımı doldurdum · (c) Genel açık rıza · (d) Psikometrik veri açık rızası · (e) Yurt dışı aktarım açık rızası. Her biri </w:t>
+      </w:r>
+      <w:r>
+        <w:rPr>
+          <w:b/>
+        </w:rPr>
+        <w:t>bağımsız</w:t>
+      </w:r>
+      <w:r>
+        <w:t>, hizmet için zorunlu olmayanlar işaretsiz bırakılabilir.</w:t>
+      </w:r>
+    </w:p>
+    <w:p>
+      <w:pPr>
+        <w:pStyle w:val="ListBullet"/>
+      </w:pPr>
+      <w:r>
+        <w:t>OAuth akışında da aynı kutular giriş ÖNCESİ gösterilir.</w:t>
+      </w:r>
+    </w:p>
+    <w:p>
+      <w:pPr>
+        <w:pStyle w:val="ListBullet"/>
+      </w:pPr>
+      <w:r>
+        <w:t xml:space="preserve">Her rıza için </w:t>
+      </w:r>
+      <w:r>
+        <w:rPr>
+          <w:b/>
+        </w:rPr>
+        <w:t>metin sürümü</w:t>
+      </w:r>
+      <w:r>
+        <w:t xml:space="preserve"> (ör. </w:t>
+      </w:r>
+      <w:r>
+        <w:rPr>
+          <w:rFonts w:ascii="Consolas" w:hAnsi="Consolas"/>
+        </w:rPr>
+        <w:t>v2026-09</w:t>
+      </w:r>
+      <w:r>
+        <w:t>) DB'ye kaydedilir -&gt; ispat.</w:t>
+      </w:r>
+    </w:p>
+    <w:p>
+      <w:pPr>
+        <w:pStyle w:val="ListBullet"/>
+      </w:pPr>
+      <w:r>
+        <w:t xml:space="preserve">Uygulama iş maddeleri: </w:t>
+      </w:r>
+      <w:r>
+        <w:rPr>
+          <w:rFonts w:ascii="Consolas" w:hAnsi="Consolas"/>
+        </w:rPr>
+        <w:t>00-KARAR-TAKIP</w:t>
+      </w:r>
+      <w:r>
+        <w:t xml:space="preserve"> madde 82 (sürümleme) + madde 83 (rıza kutusu ayrımı). </w:t>
+      </w:r>
+      <w:r>
+        <w:rPr>
+          <w:b/>
+        </w:rPr>
+        <w:t>Kod değişikliği hukukçu kararına bağlı.</w:t>
+      </w:r>
+    </w:p>
+    <w:p>
+      <w:r>
+        <w:br w:type="page"/>
+      </w:r>
+    </w:p>
+    <w:p>
+      <w:pPr>
+        <w:pStyle w:val="Heading1"/>
+      </w:pPr>
+      <w:r>
+        <w:t>3) Gizlilik Politikası</w:t>
+      </w:r>
+    </w:p>
+    <w:p>
+      <w:pPr>
+        <w:ind w:left="288"/>
+      </w:pPr>
+      <w:r>
+        <w:rPr>
+          <w:i/>
+          <w:sz w:val="19"/>
+        </w:rPr>
+        <w:t>UYARI: TASLAK (2026-08-25) — HUKUKÇU ONAYI OLMADAN YAYINLANMAZ.</w:t>
+      </w:r>
+    </w:p>
+    <w:p>
+      <w:pPr>
+        <w:ind w:left="288"/>
+      </w:pPr>
+      <w:r>
+        <w:rPr>
+          <w:i/>
+          <w:sz w:val="19"/>
+        </w:rPr>
+        <w:t xml:space="preserve">Kaynak: </w:t>
+      </w:r>
+      <w:r>
+        <w:rPr>
+          <w:rFonts w:ascii="Consolas" w:hAnsi="Consolas"/>
+          <w:i/>
+          <w:sz w:val="19"/>
+        </w:rPr>
+        <w:t>../../../raporlar/kod-denetimi/kvkk-veri-aktarim-envanteri-2026-08-25.md</w:t>
+      </w:r>
+      <w:r>
+        <w:rPr>
+          <w:i/>
+          <w:sz w:val="19"/>
+        </w:rPr>
         <w:t xml:space="preserve"> (kod gerçeği). Önceki metinler yetersiz bulundu; sıfırdan yazıldı.</w:t>
       </w:r>
     </w:p>
@@ -2579,13 +2842,12 @@
       </w:r>
       <w:r>
         <w:rPr>
-          <w:i/>
-          <w:highlight w:val="lightGray"/>
-        </w:rPr>
-        <w:t>[PO DOLDURACAK]</w:t>
-      </w:r>
-      <w:r>
-        <w:t>).</w:t>
+          <w:b/>
+        </w:rPr>
+        <w:t>Zahid Sami Ata</w:t>
+      </w:r>
+      <w:r>
+        <w:t xml:space="preserve"> — gerçek kişi/sosyal sorumluluk projesi).</w:t>
       </w:r>
     </w:p>
     <w:p>
@@ -5333,13 +5595,12 @@
       </w:r>
       <w:r>
         <w:rPr>
-          <w:i/>
-          <w:highlight w:val="lightGray"/>
-        </w:rPr>
-        <w:t>[PO DOLDURACAK]</w:t>
-      </w:r>
-      <w:r>
-        <w:t>) ile platformu kullanan kişi ("Kullanıcı") arasındaki ilişkiyi düzenler. Platform, kurumların (dernek/kulüp) mentor–menti eşleştirme programlarını yürütmelerine olanak tanıyan bir yazılım hizmetidir.</w:t>
+          <w:b/>
+        </w:rPr>
+        <w:t>Zahid Sami Ata</w:t>
+      </w:r>
+      <w:r>
+        <w:t xml:space="preserve"> — gerçek kişi/sosyal sorumluluk projesi) ile platformu kullanan kişi ("Kullanıcı") arasındaki ilişkiyi düzenler. Platform, kurumların (dernek/kulüp) mentor–menti eşleştirme programlarını yürütmelerine olanak tanıyan bir yazılım hizmetidir.</w:t>
       </w:r>
     </w:p>
     <w:p>
@@ -5616,6 +5877,29 @@
           <w:i/>
           <w:sz w:val="19"/>
         </w:rPr>
+        <w:t>İşletmeci kimliği:</w:t>
+      </w:r>
+      <w:r>
+        <w:rPr>
+          <w:i/>
+          <w:sz w:val="19"/>
+        </w:rPr>
+        <w:t xml:space="preserve"> </w:t>
+      </w:r>
+      <w:r>
+        <w:rPr>
+          <w:b/>
+          <w:i/>
+          <w:sz w:val="19"/>
+        </w:rPr>
+        <w:t>Zahid Sami Ata</w:t>
+      </w:r>
+      <w:r>
+        <w:rPr>
+          <w:i/>
+          <w:sz w:val="19"/>
+        </w:rPr>
+        <w:t xml:space="preserve"> (gerçek kişi/sosyal sorumluluk projesi). **</w:t>
       </w:r>
       <w:r>
         <w:rPr>
@@ -5630,7 +5914,7 @@
           <w:i/>
           <w:sz w:val="19"/>
         </w:rPr>
-        <w:t>:** işletmeci kimliği/iletişimi · yürürlük tarihi · varsa ücretlendirme (şu an ücretsiz).</w:t>
+        <w:t>:** işletmeci iletişim (adres/e-posta) · yürürlük tarihi · varsa ücretlendirme (şu an ücretsiz).</w:t>
       </w:r>
     </w:p>
     <w:p>
@@ -5718,7 +6002,7 @@
         <w:pStyle w:val="Heading3"/>
       </w:pPr>
       <w:r>
-        <w:t>Taraflar: [Kurum Unvanı] ("Veri Sorumlusu")  [Platform İşletmecisi] ("Veri İşleyen")</w:t>
+        <w:t>Taraflar: [Kurum Unvanı] ("Veri Sorumlusu")  **Zahid Sami Ata** (gerçek kişi/işletmeci — Platform İşletmecisi) ("Veri İşleyen")</w:t>
       </w:r>
     </w:p>
     <w:p>
@@ -6074,20 +6358,26 @@
                 <w:b/>
                 <w:sz w:val="17"/>
               </w:rPr>
-            </w:r>
-            <w:r>
-              <w:rPr>
-                <w:i/>
-                <w:sz w:val="17"/>
-                <w:highlight w:val="lightGray"/>
-              </w:rPr>
-              <w:t>[PO DOLDURACAK: sağlayıcı panelinden teyitli ülke]</w:t>
+              <w:t>Londra / Birleşik Krallık</w:t>
             </w:r>
             <w:r>
               <w:rPr>
                 <w:sz w:val="17"/>
               </w:rPr>
-              <w:t>** [KRİTİK] (belge çelişkisi — kapak)</w:t>
+              <w:t xml:space="preserve"> (AWS </w:t>
+            </w:r>
+            <w:r>
+              <w:rPr>
+                <w:rFonts w:ascii="Consolas" w:hAnsi="Consolas"/>
+                <w:sz w:val="17"/>
+              </w:rPr>
+              <w:t>eu-west-2</w:t>
+            </w:r>
+            <w:r>
+              <w:rPr>
+                <w:sz w:val="17"/>
+              </w:rPr>
+              <w:t>; PO teyitli 2026-08-26 — UYARI: AB üyesi DEĞİL)</w:t>
             </w:r>
           </w:p>
         </w:tc>

</xml_diff>

<commit_message>
docs(kvkk): tam anonimleştirme yasal metin (madde 93/39 ✅ PR'da) + H-9 + FE iş maddesi
FAZ 2-B belge senkronu (PO 1·1·1 = (c)+(iii)+(2), backend #54):
- 05-saklama-imha: anonimleştirme genişletildi (serbest metin + foto dosyası +
  oturum/token). DÜRÜST beyan KALDI — userId (cuid, kişisel değil) bağı kalır,
  "tam geri-döndürülemez" vaadi YAZILMADI. hardDelete→anonymize, "silindi" demez.
- 00-AVUKAT: H-9 sorusu eklendi (userId cuid bağı KVKK imhayı karşılar mı?) +
  bilinen boşluklar madde 39/93 güncellendi.
- 06-basvuru-formu: silme talebi = anonimleştirme (avukat onaylı yöntem).
- Word yeniden üretildi (emoji temiz, H-9/cuid/silindi mevcut, Türkçe).
- 00-KARAR-TAKIP: madde 93/39 🔀 PR'da (#54) + madde 96 ✅ PO kararı +
  YENİ madde 97 (FE hesap-kapatma akışı yok — madde 39 EK ŞART).
- 09-DURUM + 07-oturum: FAZ 2-B uygulandı, DURAK-1 çözüldü.

Co-Authored-By: Claude Opus 4.8 (1M context) <noreply@anthropic.com>
</commit_message>
<xml_diff>
--- a/docs/kararlar/konu/kvkk-metinleri/KVKK-BELGE-PAKETI-2026-08-25.docx
+++ b/docs/kararlar/konu/kvkk-metinleri/KVKK-BELGE-PAKETI-2026-08-25.docx
@@ -823,6 +823,50 @@
     </w:p>
     <w:p>
       <w:pPr>
+        <w:pStyle w:val="ListNumber"/>
+      </w:pPr>
+      <w:r>
+        <w:t>*</w:t>
+      </w:r>
+      <w:r>
+        <w:rPr>
+          <w:b/>
+        </w:rPr>
+        <w:t xml:space="preserve"> H-9 — Anonimleştirme düzeyi yeterli mi?</w:t>
+      </w:r>
+      <w:r>
+        <w:t xml:space="preserve"> Hesap kapanışında/anonimleştirmede </w:t>
+      </w:r>
+      <w:r>
+        <w:rPr>
+          <w:b/>
+        </w:rPr>
+        <w:t>tüm serbest metin ve kimlik/iletişim/kişilik alanları temizleniyor</w:t>
+      </w:r>
+      <w:r>
+        <w:t xml:space="preserve">, yüklenen fotoğraf dosyası siliniyor, oturum/jetonlar iptal ediliyor. </w:t>
+      </w:r>
+      <w:r>
+        <w:rPr>
+          <w:b/>
+        </w:rPr>
+        <w:t>Ancak kayıt anahtarı `userId` — rastgele bir kimlik (cuid), kişisel bilgi içermez — bağlı kayıtlarda (görüşme/mesaj) kalıyor</w:t>
+      </w:r>
+      <w:r>
+        <w:t xml:space="preserve"> (karşı tarafın geçmişi bozulmasın diye). </w:t>
+      </w:r>
+      <w:r>
+        <w:rPr>
+          <w:b/>
+        </w:rPr>
+        <w:t>Bu düzey KVKK imha yükümlülüğünü karşılar mı, yoksa `userId` bağının da koparılması (ilişki NULL'lama) mı gerekir?</w:t>
+      </w:r>
+      <w:r>
+        <w:t xml:space="preserve"> Ön düşüncemiz: içerik tümüyle temizlendiğinden pratik yeniden-tanımlama güçtür; ancak bunu avukat teyit etmeli. — *Belge 5.*</w:t>
+      </w:r>
+    </w:p>
+    <w:p>
+      <w:pPr>
         <w:ind w:left="288"/>
       </w:pPr>
       <w:r>
@@ -1086,26 +1130,86 @@
       </w:pPr>
       <w:r>
         <w:rPr>
+          <w:b/>
+        </w:rPr>
+        <w:t>`hardDelete` (madde 39) -&gt; anonimleştirmeye yönlendirildi</w:t>
+      </w:r>
+      <w:r>
+        <w:t xml:space="preserve"> (PO kararı, PR bekliyor): FK kısıtı nedeniyle gerçek silme çalışmıyordu; artık "silme" talebi anonimleştirir + oturum iptal eder, kullanıcıya "silindi" DENMEZ (dürüst mesaj).</w:t>
+      </w:r>
+    </w:p>
+    <w:p>
+      <w:pPr>
+        <w:pStyle w:val="ListBullet"/>
+      </w:pPr>
+      <w:r>
+        <w:rPr>
+          <w:b/>
+        </w:rPr>
+        <w:t>Anonimleştirme genişletildi (madde 93, PR bekliyor):</w:t>
+      </w:r>
+      <w:r>
+        <w:t xml:space="preserve"> kimlik/iletişim/kişilik + </w:t>
+      </w:r>
+      <w:r>
+        <w:rPr>
+          <w:b/>
+        </w:rPr>
+        <w:t>serbest metin (mesaj içeriği, görüşme not/telefon, geri-bildirim/talep/şikayet)</w:t>
+      </w:r>
+      <w:r>
+        <w:t xml:space="preserve"> + </w:t>
+      </w:r>
+      <w:r>
+        <w:rPr>
+          <w:b/>
+        </w:rPr>
+        <w:t>fiziksel foto dosyası</w:t>
+      </w:r>
+      <w:r>
+        <w:t xml:space="preserve"> + </w:t>
+      </w:r>
+      <w:r>
+        <w:rPr>
+          <w:b/>
+        </w:rPr>
+        <w:t>oturum/jetonlar</w:t>
+      </w:r>
+      <w:r>
+        <w:t xml:space="preserve"> temizlenir. </w:t>
+      </w:r>
+      <w:r>
+        <w:rPr>
+          <w:b/>
+        </w:rPr>
+        <w:t>Sınır:</w:t>
+      </w:r>
+      <w:r>
+        <w:t xml:space="preserve"> </w:t>
+      </w:r>
+      <w:r>
+        <w:rPr>
           <w:rFonts w:ascii="Consolas" w:hAnsi="Consolas"/>
         </w:rPr>
-        <w:t>hardDelete</w:t>
-      </w:r>
-      <w:r>
-        <w:t xml:space="preserve"> FK kısıtı — KVKK tam silme fiilen çalışmıyor (madde 39).</w:t>
-      </w:r>
-    </w:p>
-    <w:p>
-      <w:pPr>
-        <w:pStyle w:val="ListBullet"/>
-      </w:pPr>
+        <w:t>userId</w:t>
+      </w:r>
+      <w:r>
+        <w:t xml:space="preserve"> (rastgele cuid, kişisel bilgi içermez) bağlı kayıtlarda kalır -&gt; </w:t>
+      </w:r>
       <w:r>
         <w:rPr>
           <w:b/>
         </w:rPr>
-        <w:t>Anonimleştirme kısmi (takma-adlaştırma):</w:t>
-      </w:r>
-      <w:r>
-        <w:t xml:space="preserve"> sosyal/avatar/kişilik alanları temizlenir (2026-08-25 iyileştirildi) ama mesaj içeriği + fiziksel foto dosyası + kayıt-anahtarı bağı kalır -&gt; tam anonimleştirme iş maddesi (madde 93). Saklama-imha metni bu gerçeği beyan eder, "tam geri-döndürülemez" vaadi vermez.</w:t>
+        <w:t>H-9 (Bölüm 4)</w:t>
+      </w:r>
+      <w:r>
+        <w:t xml:space="preserve"> hukukçuya soruldu. Saklama-imha metni bu gerçeği beyan eder; "tam geri-döndürülemez" vaadi </w:t>
+      </w:r>
+      <w:r>
+        <w:rPr>
+          <w:b/>
+        </w:rPr>
+        <w:t>vermez.</w:t>
       </w:r>
     </w:p>
     <w:p>
@@ -4041,57 +4145,45 @@
       </w:pPr>
       <w:r>
         <w:rPr>
-          <w:i/>
-          <w:sz w:val="19"/>
-        </w:rPr>
-        <w:t xml:space="preserve">[KRİTİK] </w:t>
-      </w:r>
-      <w:r>
-        <w:rPr>
           <w:b/>
           <w:i/>
           <w:sz w:val="19"/>
         </w:rPr>
-        <w:t>DÜRÜST DURUM (kod teyidi 2026-08-25):</w:t>
+        <w:t>DÜRÜST DURUM (kod teyidi 2026-08-26, madde 93 genişletildi — PR bekliyor):</w:t>
       </w:r>
       <w:r>
         <w:rPr>
           <w:i/>
           <w:sz w:val="19"/>
         </w:rPr>
-        <w:t xml:space="preserve"> Mevcut anonimleştirme kimlik/iletişim/profil/sosyal-medya/kişilik alanlarını temizler</w:t>
+        <w:t xml:space="preserve"> Anonimleştirme artık kimlik/iletişim/profil/sosyal-medya/kişilik</w:t>
       </w:r>
     </w:p>
     <w:p>
       <w:pPr>
         <w:ind w:left="288"/>
       </w:pPr>
+      <w:r>
+        <w:rPr>
+          <w:i/>
+          <w:sz w:val="19"/>
+        </w:rPr>
+        <w:t xml:space="preserve">alanlarına </w:t>
+      </w:r>
       <w:r>
         <w:rPr>
           <w:b/>
           <w:i/>
           <w:sz w:val="19"/>
         </w:rPr>
-        <w:t>ama HENÜZ TAM anonimleştirme değil, kısmi (takma-adlaştırma) düzeyindedir:</w:t>
+        <w:t>EK OLARAK</w:t>
       </w:r>
       <w:r>
         <w:rPr>
           <w:i/>
           <w:sz w:val="19"/>
         </w:rPr>
-        <w:t xml:space="preserve"> kayıt anahtarı (kullanıcı kimliği) değişmediği ve mesaj</w:t>
-      </w:r>
-    </w:p>
-    <w:p>
-      <w:pPr>
-        <w:ind w:left="288"/>
-      </w:pPr>
-      <w:r>
-        <w:rPr>
-          <w:i/>
-          <w:sz w:val="19"/>
-        </w:rPr>
-        <w:t xml:space="preserve">içerikleri ile yüklenen fotoğraf dosyası silinmediği için, bağlı kayıtlar üzerinden yeniden-tanımlanma riski </w:t>
+        <w:t xml:space="preserve">: bağlı </w:t>
       </w:r>
       <w:r>
         <w:rPr>
@@ -4099,19 +4191,41 @@
           <w:i/>
           <w:sz w:val="19"/>
         </w:rPr>
-        <w:t>teorik olarak sürer.</w:t>
-      </w:r>
-    </w:p>
-    <w:p>
-      <w:pPr>
-        <w:ind w:left="288"/>
-      </w:pPr>
+        <w:t>serbest-metin</w:t>
+      </w:r>
       <w:r>
         <w:rPr>
           <w:i/>
           <w:sz w:val="19"/>
         </w:rPr>
-        <w:t xml:space="preserve">Tam anonimleştirme bir </w:t>
+        <w:t xml:space="preserve"> içerikleri (mesaj içeriği -&gt; </w:t>
+      </w:r>
+      <w:r>
+        <w:rPr>
+          <w:rFonts w:ascii="Consolas" w:hAnsi="Consolas"/>
+          <w:i/>
+          <w:sz w:val="19"/>
+        </w:rPr>
+        <w:t>[silindi]</w:t>
+      </w:r>
+      <w:r>
+        <w:rPr>
+          <w:i/>
+          <w:sz w:val="19"/>
+        </w:rPr>
+        <w:t>; görüşme not/telefon; geri-bildirim, talep, şikayet</w:t>
+      </w:r>
+    </w:p>
+    <w:p>
+      <w:pPr>
+        <w:ind w:left="288"/>
+      </w:pPr>
+      <w:r>
+        <w:rPr>
+          <w:i/>
+          <w:sz w:val="19"/>
+        </w:rPr>
+        <w:t xml:space="preserve">serbest metinleri; sözleşme menti-hedefi), </w:t>
       </w:r>
       <w:r>
         <w:rPr>
@@ -4119,14 +4233,14 @@
           <w:i/>
           <w:sz w:val="19"/>
         </w:rPr>
-        <w:t>iş maddesidir</w:t>
+        <w:t>yüklenen fotoğrafın fiziksel dosyası</w:t>
       </w:r>
       <w:r>
         <w:rPr>
           <w:i/>
           <w:sz w:val="19"/>
         </w:rPr>
-        <w:t xml:space="preserve"> (madde 93). Bu metin, "geri döndürülemez tam anonimleştirme" </w:t>
+        <w:t xml:space="preserve"> ve </w:t>
       </w:r>
       <w:r>
         <w:rPr>
@@ -4134,14 +4248,175 @@
           <w:i/>
           <w:sz w:val="19"/>
         </w:rPr>
-        <w:t>vaadi VERMEZ</w:t>
+        <w:t>oturum/erişim jetonları</w:t>
       </w:r>
       <w:r>
         <w:rPr>
           <w:i/>
           <w:sz w:val="19"/>
         </w:rPr>
-        <w:t xml:space="preserve"> — mevcut gerçeği beyan eder.</w:t>
+        <w:t xml:space="preserve"> temizlenir; hesap her kurumda pasife alınır.</w:t>
+      </w:r>
+    </w:p>
+    <w:p>
+      <w:pPr>
+        <w:ind w:left="288"/>
+      </w:pPr>
+      <w:r>
+        <w:rPr>
+          <w:b/>
+          <w:i/>
+          <w:sz w:val="19"/>
+        </w:rPr>
+        <w:t>UYARI: AMA "TAM geri döndürülemez anonimleştirme" DEĞİLDİR:</w:t>
+      </w:r>
+      <w:r>
+        <w:rPr>
+          <w:i/>
+          <w:sz w:val="19"/>
+        </w:rPr>
+        <w:t xml:space="preserve"> kayıt anahtarı </w:t>
+      </w:r>
+      <w:r>
+        <w:rPr>
+          <w:rFonts w:ascii="Consolas" w:hAnsi="Consolas"/>
+          <w:i/>
+          <w:sz w:val="19"/>
+        </w:rPr>
+        <w:t>userId</w:t>
+      </w:r>
+      <w:r>
+        <w:rPr>
+          <w:i/>
+          <w:sz w:val="19"/>
+        </w:rPr>
+        <w:t xml:space="preserve"> — </w:t>
+      </w:r>
+      <w:r>
+        <w:rPr>
+          <w:b/>
+          <w:i/>
+          <w:sz w:val="19"/>
+        </w:rPr>
+        <w:t>rastgele bir kimlik (cuid); kişisel bilgi içermez</w:t>
+      </w:r>
+      <w:r>
+        <w:rPr>
+          <w:i/>
+          <w:sz w:val="19"/>
+        </w:rPr>
+        <w:t xml:space="preserve"> — bağlı</w:t>
+      </w:r>
+    </w:p>
+    <w:p>
+      <w:pPr>
+        <w:ind w:left="288"/>
+      </w:pPr>
+      <w:r>
+        <w:rPr>
+          <w:i/>
+          <w:sz w:val="19"/>
+        </w:rPr>
+        <w:t xml:space="preserve">kayıtlarda </w:t>
+      </w:r>
+      <w:r>
+        <w:rPr>
+          <w:b/>
+          <w:i/>
+          <w:sz w:val="19"/>
+        </w:rPr>
+        <w:t>kalır</w:t>
+      </w:r>
+      <w:r>
+        <w:rPr>
+          <w:i/>
+          <w:sz w:val="19"/>
+        </w:rPr>
+        <w:t>, böylece karşı tarafın (görüşme/mesaj) geçmişi bozulmaz. Tüm serbest metin ve kimlik alanları temizlendiği için pratik yeniden-tanımlama</w:t>
+      </w:r>
+    </w:p>
+    <w:p>
+      <w:pPr>
+        <w:ind w:left="288"/>
+      </w:pPr>
+      <w:r>
+        <w:rPr>
+          <w:i/>
+          <w:sz w:val="19"/>
+        </w:rPr>
+        <w:t xml:space="preserve">güçtür; ancak bu düzeyin KVKK imha yükümlülüğünü </w:t>
+      </w:r>
+      <w:r>
+        <w:rPr>
+          <w:b/>
+          <w:i/>
+          <w:sz w:val="19"/>
+        </w:rPr>
+        <w:t>tam</w:t>
+      </w:r>
+      <w:r>
+        <w:rPr>
+          <w:i/>
+          <w:sz w:val="19"/>
+        </w:rPr>
+        <w:t xml:space="preserve"> karşılayıp karşılamadığı </w:t>
+      </w:r>
+      <w:r>
+        <w:rPr>
+          <w:b/>
+          <w:i/>
+          <w:sz w:val="19"/>
+        </w:rPr>
+        <w:t>hukukçuya soruldu (kapak H-9).</w:t>
+      </w:r>
+      <w:r>
+        <w:rPr>
+          <w:i/>
+          <w:sz w:val="19"/>
+        </w:rPr>
+        <w:t xml:space="preserve"> Bu metin, "geri döndürülemez tam</w:t>
+      </w:r>
+    </w:p>
+    <w:p>
+      <w:pPr>
+        <w:ind w:left="288"/>
+      </w:pPr>
+      <w:r>
+        <w:rPr>
+          <w:i/>
+          <w:sz w:val="19"/>
+        </w:rPr>
+        <w:t xml:space="preserve">anonimleştirme" </w:t>
+      </w:r>
+      <w:r>
+        <w:rPr>
+          <w:b/>
+          <w:i/>
+          <w:sz w:val="19"/>
+        </w:rPr>
+        <w:t>vaadi VERMEZ</w:t>
+      </w:r>
+      <w:r>
+        <w:rPr>
+          <w:i/>
+          <w:sz w:val="19"/>
+        </w:rPr>
+        <w:t xml:space="preserve"> — mevcut gerçeği beyan eder. (Detay: </w:t>
+      </w:r>
+      <w:r>
+        <w:rPr>
+          <w:rFonts w:ascii="Consolas" w:hAnsi="Consolas"/>
+          <w:i/>
+          <w:sz w:val="19"/>
+        </w:rPr>
+        <w:t>00-KARAR-TAKIP</w:t>
+      </w:r>
+      <w:r>
+        <w:rPr>
+          <w:i/>
+          <w:sz w:val="19"/>
+        </w:rPr>
+        <w:t xml:space="preserve"> madde 93/39/96.)</w:t>
       </w:r>
     </w:p>
     <w:tbl>
@@ -4457,16 +4732,22 @@
           <w:p>
             <w:r>
               <w:rPr>
+                <w:sz w:val="17"/>
+              </w:rPr>
+              <w:t xml:space="preserve">Hesap kapanışında </w:t>
+            </w:r>
+            <w:r>
+              <w:rPr>
                 <w:b/>
                 <w:sz w:val="17"/>
               </w:rPr>
-              <w:t>Süresiz</w:t>
+              <w:t>yazarın içeriği `[silindi]`</w:t>
             </w:r>
             <w:r>
               <w:rPr>
                 <w:sz w:val="17"/>
               </w:rPr>
-              <w:t xml:space="preserve"> — hesap silmede bile silinmiyor (madde 39)</w:t>
+              <w:t xml:space="preserve"> olur (karşı tarafınki + sohbet iskeleti kalır) — madde 93 (PR bekliyor)</w:t>
             </w:r>
           </w:p>
         </w:tc>
@@ -4479,7 +4760,7 @@
               <w:rPr>
                 <w:sz w:val="17"/>
               </w:rPr>
-              <w:t>HAYIR YOK</w:t>
+              <w:t>HAYIR süre-bazlı YOK</w:t>
             </w:r>
           </w:p>
         </w:tc>
@@ -4499,7 +4780,7 @@
               <w:rPr>
                 <w:sz w:val="17"/>
               </w:rPr>
-              <w:t xml:space="preserve"> + hesap silmede anonimleştirme/silme (madde 39 düzeltmesine bağlı)</w:t>
+              <w:t xml:space="preserve"> genel saklama; hesap kapanışında yazarın içeriği anonimleştirilir</w:t>
             </w:r>
           </w:p>
         </w:tc>
@@ -4861,7 +5142,7 @@
         <w:pStyle w:val="Heading2"/>
       </w:pPr>
       <w:r>
-        <w:t>Mevcut imha yetenekleri (kod — 2026-08-25 teyidi)</w:t>
+        <w:t>Mevcut imha yetenekleri (kod — 2026-08-26 teyidi, madde 93 genişletildi, PR bekliyor)</w:t>
       </w:r>
     </w:p>
     <w:p>
@@ -4884,7 +5165,52 @@
         <w:t>sosyal medya bağlantıları (LinkedIn/Instagram), avatar bağlantısı</w:t>
       </w:r>
       <w:r>
-        <w:t>, kişilik verileri (DISC/mizaç/enneagram/"aha" kartı), test yanıtları, kurum-profil kişilik alanları.</w:t>
+        <w:t xml:space="preserve">, kişilik verileri (DISC/mizaç/enneagram/"aha" kartı), test yanıtları, kurum-profil kişilik alanları. </w:t>
+      </w:r>
+      <w:r>
+        <w:rPr>
+          <w:b/>
+        </w:rPr>
+        <w:t>YENİ (madde 93):</w:t>
+      </w:r>
+      <w:r>
+        <w:t xml:space="preserve"> bağlı </w:t>
+      </w:r>
+      <w:r>
+        <w:rPr>
+          <w:b/>
+        </w:rPr>
+        <w:t>serbest-metin</w:t>
+      </w:r>
+      <w:r>
+        <w:t xml:space="preserve"> (yazarın </w:t>
+      </w:r>
+      <w:r>
+        <w:rPr>
+          <w:b/>
+        </w:rPr>
+        <w:t>mesaj içeriği -&gt; `[silindi]`</w:t>
+      </w:r>
+      <w:r>
+        <w:t xml:space="preserve">, görüşme not/telefon/adres, geri-bildirim/talep/şikayet serbest metinleri, sözleşme menti-hedefi), </w:t>
+      </w:r>
+      <w:r>
+        <w:rPr>
+          <w:b/>
+        </w:rPr>
+        <w:t>yüklenen fotoğrafın fiziksel dosyası</w:t>
+      </w:r>
+      <w:r>
+        <w:t xml:space="preserve"> (diskten silinir), </w:t>
+      </w:r>
+      <w:r>
+        <w:rPr>
+          <w:b/>
+        </w:rPr>
+        <w:t>oturum/erişim jetonları</w:t>
+      </w:r>
+      <w:r>
+        <w:t xml:space="preserve"> (RefreshToken/PasswordResetToken silinir + üyelik pasife alınır -&gt; eski token'la işlem yapılamaz).</w:t>
       </w:r>
     </w:p>
     <w:p>
@@ -4895,164 +5221,166 @@
         <w:rPr>
           <w:b/>
         </w:rPr>
-        <w:t>UYARI: Anonimleştirme ŞU AN TEMİZLEMEZ (madde 93 — açık uyum boşluğu):</w:t>
-      </w:r>
-      <w:r>
-        <w:t xml:space="preserve"> (a) </w:t>
+        <w:t>UYARI: Anonimleştirmenin SINIRI (dürüst):</w:t>
+      </w:r>
+      <w:r>
+        <w:t xml:space="preserve"> kayıt anahtarı </w:t>
+      </w:r>
+      <w:r>
+        <w:rPr>
+          <w:rFonts w:ascii="Consolas" w:hAnsi="Consolas"/>
+        </w:rPr>
+        <w:t>userId</w:t>
+      </w:r>
+      <w:r>
+        <w:t xml:space="preserve"> — </w:t>
       </w:r>
       <w:r>
         <w:rPr>
           <w:b/>
         </w:rPr>
-        <w:t>mesaj içerikleri</w:t>
-      </w:r>
-      <w:r>
-        <w:t xml:space="preserve"> (</w:t>
+        <w:t>rastgele cuid, kişisel bilgi içermez</w:t>
+      </w:r>
+      <w:r>
+        <w:t xml:space="preserve"> — bağlı kayıtlarda </w:t>
+      </w:r>
+      <w:r>
+        <w:rPr>
+          <w:b/>
+        </w:rPr>
+        <w:t>kalır</w:t>
+      </w:r>
+      <w:r>
+        <w:t xml:space="preserve"> (karşı tarafın geçmişi bozulmasın diye). Bu yüzden bu düzeyin KVKK imha yükümlülüğünü tam karşılayıp karşılamadığı </w:t>
+      </w:r>
+      <w:r>
+        <w:rPr>
+          <w:b/>
+        </w:rPr>
+        <w:t>hukukçuya soruldu (kapak H-9).</w:t>
+      </w:r>
+      <w:r>
+        <w:t xml:space="preserve"> "Tam geri döndürülemez anonim" </w:t>
+      </w:r>
+      <w:r>
+        <w:rPr>
+          <w:b/>
+        </w:rPr>
+        <w:t>vaadi verilmez.</w:t>
+      </w:r>
+    </w:p>
+    <w:p>
+      <w:pPr>
+        <w:pStyle w:val="ListBullet"/>
+      </w:pPr>
+      <w:r>
+        <w:rPr>
+          <w:b/>
+        </w:rPr>
+        <w:t>"Kalıcı silme" (`hardDeleteUser`) — madde 39:</w:t>
+      </w:r>
+      <w:r>
+        <w:t xml:space="preserve"> FK kısıtı nedeniyle gerçek silme çalışmıyordu -&gt; </w:t>
+      </w:r>
+      <w:r>
+        <w:rPr>
+          <w:b/>
+        </w:rPr>
+        <w:t>anonimleştirmeye yönlendirildi</w:t>
+      </w:r>
+      <w:r>
+        <w:t xml:space="preserve"> (PO kararı). Kullanıcıya "silindi" DENMEZ; dürüst mesaj: *"Hesabınız kapatıldı ve kimliğinizle ilişkilendirilebilir verileriniz geri döndürülemez şekilde anonimleştirildi; ortak kayıtlarda kimliğiniz kaldırıldı."*</w:t>
+      </w:r>
+    </w:p>
+    <w:p>
+      <w:pPr>
+        <w:pStyle w:val="Heading2"/>
+      </w:pPr>
+      <w:r>
+        <w:t>Bilinen boşluklar (dürüst — iş maddeleri)</w:t>
+      </w:r>
+    </w:p>
+    <w:p>
+      <w:pPr>
+        <w:pStyle w:val="ListBullet"/>
+      </w:pPr>
+      <w:r>
+        <w:rPr>
+          <w:b/>
+        </w:rPr>
+        <w:t>Anonimleştirme genişletildi (madde 93 — PR bekliyor):</w:t>
+      </w:r>
+      <w:r>
+        <w:t xml:space="preserve"> serbest metin + fiziksel foto + oturum artık temizlenir. </w:t>
+      </w:r>
+      <w:r>
+        <w:rPr>
+          <w:b/>
+        </w:rPr>
+        <w:t>KALAN sınır:</w:t>
+      </w:r>
+      <w:r>
+        <w:t xml:space="preserve"> </w:t>
       </w:r>
       <w:r>
         <w:rPr>
           <w:rFonts w:ascii="Consolas" w:hAnsi="Consolas"/>
         </w:rPr>
-        <w:t>Message.content</w:t>
-      </w:r>
-      <w:r>
-        <w:t xml:space="preserve">) · (b) </w:t>
-      </w:r>
+        <w:t>userId</w:t>
+      </w:r>
+      <w:r>
+        <w:t xml:space="preserve"> (cuid) bağı — hukukçu değerlendirmesine bağlı (H-9). Tam "geri döndürülemez" vaadi verilmez.</w:t>
+      </w:r>
+    </w:p>
+    <w:p>
+      <w:pPr>
+        <w:pStyle w:val="ListBullet"/>
+      </w:pPr>
       <w:r>
         <w:rPr>
           <w:b/>
         </w:rPr>
-        <w:t>yüklenen fotoğrafın fiziksel dosyası</w:t>
-      </w:r>
-      <w:r>
-        <w:t xml:space="preserve"> (yalnız bağlantı temizlenir, dosya diskte kalır) · (c) </w:t>
-      </w:r>
+        <w:t>Genel otomatik imha/periyodik anonimleştirme süreci YOK</w:t>
+      </w:r>
+      <w:r>
+        <w:t xml:space="preserve"> (yalnız SystemLog) -&gt; </w:t>
+      </w:r>
+      <w:r>
+        <w:rPr>
+          <w:rFonts w:ascii="Consolas" w:hAnsi="Consolas"/>
+        </w:rPr>
+        <w:t>00-KARAR-TAKIP</w:t>
+      </w:r>
+      <w:r>
+        <w:t xml:space="preserve"> madde 81.</w:t>
+      </w:r>
+    </w:p>
+    <w:p>
+      <w:pPr>
+        <w:pStyle w:val="ListBullet"/>
+      </w:pPr>
       <w:r>
         <w:rPr>
           <w:b/>
         </w:rPr>
-        <w:t>görüşme not/telefon alanları</w:t>
-      </w:r>
-      <w:r>
-        <w:t xml:space="preserve"> · (d) </w:t>
-      </w:r>
+        <w:t>hardDelete (madde 39):</w:t>
+      </w:r>
+      <w:r>
+        <w:t xml:space="preserve"> anonimleştirmeye yönlendirildi (PR bekliyor); "silme" endpoint'i artık patlamaz, gerçeği söyler.</w:t>
+      </w:r>
+    </w:p>
+    <w:p>
+      <w:pPr>
+        <w:pStyle w:val="ListBullet"/>
+      </w:pPr>
       <w:r>
         <w:rPr>
           <w:b/>
         </w:rPr>
-        <w:t>kayıt anahtarı (kullanıcı kimliği) değişmez</w:t>
-      </w:r>
-      <w:r>
-        <w:t xml:space="preserve"> -&gt; bağlı tablolar üzerinden teorik yeniden-tanımlanma. Bu nedenle mevcut düzey </w:t>
-      </w:r>
-      <w:r>
-        <w:rPr>
-          <w:b/>
-        </w:rPr>
-        <w:t>takma-adlaştırma</w:t>
-      </w:r>
-      <w:r>
-        <w:t>dır; tam anonimleştirme iş maddesidir.</w:t>
-      </w:r>
-    </w:p>
-    <w:p>
-      <w:pPr>
-        <w:pStyle w:val="ListBullet"/>
-      </w:pPr>
-      <w:r>
-        <w:rPr>
-          <w:b/>
-        </w:rPr>
-        <w:t>Kalıcı silme (`hardDeleteUser`):</w:t>
-      </w:r>
-      <w:r>
-        <w:t xml:space="preserve"> bir kısım tabloyu siler; </w:t>
-      </w:r>
-      <w:r>
-        <w:rPr>
-          <w:b/>
-        </w:rPr>
-        <w:t>ancak Meeting/Feedback/Message gibi kayıtlar teknik kısıt (FK) nedeniyle şu an silinemiyor -&gt; işlem gerçek veride başarısız olabilir</w:t>
-      </w:r>
-      <w:r>
-        <w:t xml:space="preserve"> (madde 39 — düzeltilecek).</w:t>
-      </w:r>
-    </w:p>
-    <w:p>
-      <w:pPr>
-        <w:pStyle w:val="Heading2"/>
-      </w:pPr>
-      <w:r>
-        <w:t>Bilinen boşluklar (dürüst — iş maddeleri)</w:t>
-      </w:r>
-    </w:p>
-    <w:p>
-      <w:pPr>
-        <w:pStyle w:val="ListBullet"/>
-      </w:pPr>
-      <w:r>
-        <w:rPr>
-          <w:b/>
-        </w:rPr>
-        <w:t>Tam anonimleştirme eksik (takma-adlaştırma düzeyi)</w:t>
-      </w:r>
-      <w:r>
-        <w:t xml:space="preserve"> -&gt; mesaj içeriği + fiziksel foto dosyası + kayıt-anahtarı bağı temizlenmiyor -&gt; </w:t>
-      </w:r>
-      <w:r>
-        <w:rPr>
-          <w:rFonts w:ascii="Consolas" w:hAnsi="Consolas"/>
-        </w:rPr>
-        <w:t>00-KARAR-TAKIP</w:t>
-      </w:r>
-      <w:r>
-        <w:t xml:space="preserve"> </w:t>
-      </w:r>
-      <w:r>
-        <w:rPr>
-          <w:b/>
-        </w:rPr>
-        <w:t>madde 93</w:t>
-      </w:r>
-      <w:r>
-        <w:t>.</w:t>
-      </w:r>
-    </w:p>
-    <w:p>
-      <w:pPr>
-        <w:pStyle w:val="ListBullet"/>
-      </w:pPr>
-      <w:r>
-        <w:rPr>
-          <w:b/>
-        </w:rPr>
-        <w:t>Genel otomatik imha/periyodik anonimleştirme süreci YOK</w:t>
-      </w:r>
-      <w:r>
-        <w:t xml:space="preserve"> (yalnız SystemLog) -&gt; </w:t>
-      </w:r>
-      <w:r>
-        <w:rPr>
-          <w:rFonts w:ascii="Consolas" w:hAnsi="Consolas"/>
-        </w:rPr>
-        <w:t>00-KARAR-TAKIP</w:t>
-      </w:r>
-      <w:r>
-        <w:t xml:space="preserve"> madde 81.</w:t>
-      </w:r>
-    </w:p>
-    <w:p>
-      <w:pPr>
-        <w:pStyle w:val="ListBullet"/>
-      </w:pPr>
-      <w:r>
-        <w:rPr>
-          <w:b/>
-        </w:rPr>
-        <w:t>hardDelete FK kısıtı</w:t>
-      </w:r>
-      <w:r>
-        <w:t xml:space="preserve"> (madde 39) — KVKK silme hakkının fiilen çalışması için düzeltme gerekli.</w:t>
+        <w:t>FE hak-kullanım ekranı YOK</w:t>
+      </w:r>
+      <w:r>
+        <w:t xml:space="preserve"> (kullanıcının kendi hesabını kapatma/anonimleştirme akışı) -&gt; iş maddesi (madde 40/84 ile bağlı).</w:t>
       </w:r>
     </w:p>
     <w:p>
@@ -5328,16 +5656,31 @@
         <w:pStyle w:val="ListBullet"/>
       </w:pPr>
       <w:r>
-        <w:t xml:space="preserve">Silme talebinde, teknik kısıt (madde 39) nedeniyle bazı kayıtlar şu an yalnız </w:t>
-      </w:r>
-      <w:r>
         <w:rPr>
           <w:b/>
         </w:rPr>
-        <w:t>anonimleştirilebilir</w:t>
-      </w:r>
-      <w:r>
-        <w:t>; tam silme düzeltmesi bir iş maddesidir.</w:t>
+        <w:t>Silme/kapatma talebi anonimleştirmeyle karşılanır</w:t>
+      </w:r>
+      <w:r>
+        <w:t xml:space="preserve"> (avukat onaylı yöntem — silme yerine anonimleştirme): kimliğinizle ilişkilendirilebilir veriler (ad, iletişim, kişilik, </w:t>
+      </w:r>
+      <w:r>
+        <w:rPr>
+          <w:b/>
+        </w:rPr>
+        <w:t>serbest metin/mesaj içeriği</w:t>
+      </w:r>
+      <w:r>
+        <w:t xml:space="preserve">, yüklenen fotoğraf) geri döndürülemez şekilde temizlenir, oturumunuz kapatılır. Ortak kayıtlarda (görüşme/mesaj) kimliğiniz kaldırılır; içerik anonimleştirilir. *(Teknik ayrıntı: </w:t>
+      </w:r>
+      <w:r>
+        <w:rPr>
+          <w:rFonts w:ascii="Consolas" w:hAnsi="Consolas"/>
+        </w:rPr>
+        <w:t>00-KARAR-TAKIP</w:t>
+      </w:r>
+      <w:r>
+        <w:t xml:space="preserve"> madde 39/93; anonimleştirme düzeyi hukukçu değerlendirmesinde — kapak H-9.)*</w:t>
       </w:r>
     </w:p>
     <w:p>

</xml_diff>